<commit_message>
Reporte P07 actualizado con los tres puntos de la asignacion (faro del avion)
Co-Authored-By: Claude Opus 5.5 <noreply@anthropic.com>
Claude-Session: https://claude.ai/code/session_01JkF6vY7sj1nepm4gaevpui
</commit_message>
<xml_diff>
--- a/Entregables/P07-118001740.docx
+++ b/Entregables/P07-118001740.docx
@@ -454,7 +454,7 @@
           <w:sz w:val="32"/>
           <w:szCs w:val="32"/>
         </w:rPr>
-        <w:t xml:space="preserve">FECHA DE ENTREGA LÍMITE: 11 de octubre de 2026 </w:t>
+        <w:t xml:space="preserve">FECHA DE ENTREGA LÍMITE: 10 de octubre de 2026 </w:t>
       </w:r>
     </w:p>
     <w:p>
@@ -635,7 +635,7 @@
           <w:i w:val="0"/>
           <w:sz w:val="24"/>
         </w:rPr>
-        <w:t>La escena parte del código base de la práctica 7 con el modelo de Phong activado en el fragment shader. Sobre ella están el rover de la práctica 5, que se mueve con el teclado y lleva un faro azul; el avión de la práctica 6, que sube y baja con una luz amarilla en la parte inferior; y una lámpara importada con su luz puntual blanca. También siguen el dado y el holocrón por código del ejercicio de clase, el helicóptero y el agave del profesor. El proyecto se compiló con CMake y se ejecutó en macOS (OpenGL 4.1 Metal, GLSL 4.10).</w:t>
+        <w:t>La escena parte del código base de la práctica 7 con el modelo de Phong activado en el fragment shader. Los tres ejercicios del reporte se hicieron con mis modelos con jerarquía: el rover de la práctica 5 lleva un faro frontal, y el avión de la práctica 6 lleva una luz hacia abajo y un faro hacia adelante. También está la lámpara importada con su luz puntual blanca que pide el manual. El proyecto se compiló con CMake y se ejecutó en macOS (OpenGL 4.1 Metal, GLSL 4.10).</w:t>
       </w:r>
     </w:p>
     <w:p>
@@ -724,22 +724,6 @@
     </w:p>
     <w:p>
       <w:pPr>
-        <w:spacing w:before="160" w:after="80" w:line="276" w:lineRule="auto"/>
-        <w:ind w:left="340"/>
-        <w:jc w:val="both"/>
-      </w:pPr>
-      <w:r>
-        <w:rPr>
-          <w:rFonts w:ascii="Arial" w:hAnsi="Arial" w:cs="Arial"/>
-          <w:b/>
-          <w:i w:val="0"/>
-          <w:sz w:val="24"/>
-        </w:rPr>
-        <w:t>a) Movimiento con teclado</w:t>
-      </w:r>
-    </w:p>
-    <w:p>
-      <w:pPr>
         <w:spacing w:before="0" w:after="120" w:line="276" w:lineRule="auto"/>
         <w:ind w:left="340"/>
         <w:jc w:val="both"/>
@@ -751,7 +735,7 @@
           <w:i w:val="0"/>
           <w:sz w:val="24"/>
         </w:rPr>
-        <w:t>El rover avanza con Y y retrocede con U; el avión sube con flecha arriba y baja con flecha abajo. Las teclas se leen en el ciclo principal con el arreglo keys de Window, igual que el control de patas de la práctica 5, y el desplazamiento se multiplica por deltaTime para que no dependa de los cuadros por segundo. Las posiciones se limitan con glm::clamp para que los modelos no salgan del piso. La L enciende y apaga la linterna de la cámara; se compara con el estado del cuadro anterior para que un solo toque cambie el estado una vez.</w:t>
+        <w:t>Las tres luces del reporte siguen la misma idea: la posición de cada spotlight se calcula en cada cuadro con la matriz que se usa para dibujar el modelo. Así la luz queda unida al modelo en su jerarquía y se mueve con él sin código extra para cada tecla. Las teclas se leen en el ciclo principal con el arreglo keys de Window y el desplazamiento se multiplica por deltaTime.</w:t>
       </w:r>
     </w:p>
     <w:p>
@@ -763,7 +747,7 @@
       <w:r>
         <w:drawing>
           <wp:inline xmlns:a="http://schemas.openxmlformats.org/drawingml/2006/main">
-            <wp:extent cx="4860000" cy="1269730"/>
+            <wp:extent cx="5040000" cy="1702703"/>
             <wp:docPr id="4" name="Picture 4"/>
             <wp:cNvGraphicFramePr>
               <a:graphicFrameLocks noChangeAspect="1"/>
@@ -784,7 +768,7 @@
                   <pic:spPr>
                     <a:xfrm>
                       <a:off x="0" y="0"/>
-                      <a:ext cx="4860000" cy="1269730"/>
+                      <a:ext cx="5040000" cy="1702703"/>
                     </a:xfrm>
                     <a:prstGeom prst="rect"/>
                   </pic:spPr>
@@ -816,55 +800,7 @@
           <w:i/>
           <w:sz w:val="18"/>
         </w:rPr>
-        <w:t>Lectura de teclas en el ciclo principal.</w:t>
-      </w:r>
-    </w:p>
-    <w:p>
-      <w:pPr>
-        <w:spacing w:before="0" w:after="120" w:line="276" w:lineRule="auto"/>
-        <w:ind w:left="340"/>
-        <w:jc w:val="both"/>
-      </w:pPr>
-      <w:r>
-        <w:rPr>
-          <w:rFonts w:ascii="Arial" w:hAnsi="Arial" w:cs="Arial"/>
-          <w:b w:val="0"/>
-          <w:i w:val="0"/>
-          <w:sz w:val="24"/>
-        </w:rPr>
-        <w:t>Las variables posRoverX y posAvionY entran directamente en la traslación de la matriz base de cada modelo. Esa misma matriz se usa después para colocar su luz.</w:t>
-      </w:r>
-    </w:p>
-    <w:p>
-      <w:pPr>
-        <w:spacing w:before="160" w:after="80" w:line="276" w:lineRule="auto"/>
-        <w:ind w:left="340"/>
-        <w:jc w:val="both"/>
-      </w:pPr>
-      <w:r>
-        <w:rPr>
-          <w:rFonts w:ascii="Arial" w:hAnsi="Arial" w:cs="Arial"/>
-          <w:b/>
-          <w:i w:val="0"/>
-          <w:sz w:val="24"/>
-        </w:rPr>
-        <w:t>b) Spotlight amarilla que apunta al piso (avión)</w:t>
-      </w:r>
-    </w:p>
-    <w:p>
-      <w:pPr>
-        <w:spacing w:before="0" w:after="120" w:line="276" w:lineRule="auto"/>
-        <w:ind w:left="340"/>
-        <w:jc w:val="both"/>
-      </w:pPr>
-      <w:r>
-        <w:rPr>
-          <w:rFonts w:ascii="Arial" w:hAnsi="Arial" w:cs="Arial"/>
-          <w:b w:val="0"/>
-          <w:i w:val="0"/>
-          <w:sz w:val="24"/>
-        </w:rPr>
-        <w:t>Es spotLights[2]: color (1, 1, 0), intensidad difusa 3, atenuación con 1, lin 0.1 y exp 0.01, y un cono de 25°. Su dirección es fija, (0, −1, 0). La posición se calcula en cada cuadro multiplicando la matriz del avión por el punto (0, −1.05, 0.5), que queda debajo del fuselaje; así la luz sube y baja con el avión sin tener que mover dos cosas por separado.</w:t>
+        <w:t>Teclas del rover (Y/U), del avión (flechas y H/J) y de la linterna (L).</w:t>
       </w:r>
     </w:p>
     <w:p>
@@ -876,7 +812,7 @@
       <w:r>
         <w:drawing>
           <wp:inline xmlns:a="http://schemas.openxmlformats.org/drawingml/2006/main">
-            <wp:extent cx="5220000" cy="1888887"/>
+            <wp:extent cx="5220000" cy="2803732"/>
             <wp:docPr id="5" name="Picture 5"/>
             <wp:cNvGraphicFramePr>
               <a:graphicFrameLocks noChangeAspect="1"/>
@@ -897,7 +833,7 @@
                   <pic:spPr>
                     <a:xfrm>
                       <a:off x="0" y="0"/>
-                      <a:ext cx="5220000" cy="1888887"/>
+                      <a:ext cx="5220000" cy="2803732"/>
                     </a:xfrm>
                     <a:prstGeom prst="rect"/>
                   </pic:spPr>
@@ -929,7 +865,7 @@
           <w:i/>
           <w:sz w:val="18"/>
         </w:rPr>
-        <w:t>Declaración de la spotlight amarilla del avión y del faro azul del rover.</w:t>
+        <w:t>Declaración de las tres spotlight: luz inferior del avión, faro del rover y faro delantero del avión.</w:t>
       </w:r>
     </w:p>
     <w:p>
@@ -941,7 +877,7 @@
       <w:r>
         <w:drawing>
           <wp:inline xmlns:a="http://schemas.openxmlformats.org/drawingml/2006/main">
-            <wp:extent cx="5580000" cy="2033690"/>
+            <wp:extent cx="5580000" cy="2205694"/>
             <wp:docPr id="6" name="Picture 6"/>
             <wp:cNvGraphicFramePr>
               <a:graphicFrameLocks noChangeAspect="1"/>
@@ -962,7 +898,7 @@
                   <pic:spPr>
                     <a:xfrm>
                       <a:off x="0" y="0"/>
-                      <a:ext cx="5580000" cy="2033690"/>
+                      <a:ext cx="5580000" cy="2205694"/>
                     </a:xfrm>
                     <a:prstGeom prst="rect"/>
                   </pic:spPr>
@@ -994,7 +930,24 @@
           <w:i/>
           <w:sz w:val="18"/>
         </w:rPr>
-        <w:t>Las dos luces se colocan con la matriz de su modelo antes de mandarlas al shader.</w:t>
+        <w:t>Cada luz se coloca con la matriz de su modelo antes de mandarla al shader.</w:t>
+      </w:r>
+    </w:p>
+    <w:p>
+      <w:pPr>
+        <w:keepNext/>
+        <w:spacing w:before="160" w:after="80" w:line="276" w:lineRule="auto"/>
+        <w:ind w:left="340"/>
+        <w:jc w:val="both"/>
+      </w:pPr>
+      <w:r>
+        <w:rPr>
+          <w:rFonts w:ascii="Arial" w:hAnsi="Arial" w:cs="Arial"/>
+          <w:b/>
+          <w:i w:val="0"/>
+          <w:sz w:val="24"/>
+        </w:rPr>
+        <w:t>a) Faro frontal del rover</w:t>
       </w:r>
     </w:p>
     <w:p>
@@ -1010,7 +963,7 @@
           <w:i w:val="0"/>
           <w:sz w:val="24"/>
         </w:rPr>
-        <w:t>Con el avión arriba el círculo es más grande y más tenue: el cono abarca más piso y la atenuación crece con la distancia. Con el avión abajo el círculo es pequeño y brillante.</w:t>
+        <w:t>El rover es el de la práctica 5. Para que también tuviera jerarquía de llantas separé en Blender cada llanta de su pata: las llantas tienen su propio material, así que se separaron por material, se les puso el origen en el centro de su caja envolvente y se exportaron centradas; la pata se exportó con sus coordenadas originales para no mover su punto de unión con el cuerpo. La jerarquía queda cuerpo → pata → llanta, y cada llanta gira sobre su eje Z según la distancia recorrida entre su radio (1.241 por la escala de 0.4).</w:t>
       </w:r>
     </w:p>
     <w:p>
@@ -1022,7 +975,7 @@
       <w:r>
         <w:drawing>
           <wp:inline xmlns:a="http://schemas.openxmlformats.org/drawingml/2006/main">
-            <wp:extent cx="5580000" cy="1562863"/>
+            <wp:extent cx="5220000" cy="3006809"/>
             <wp:docPr id="7" name="Picture 7"/>
             <wp:cNvGraphicFramePr>
               <a:graphicFrameLocks noChangeAspect="1"/>
@@ -1031,7 +984,7 @@
               <a:graphicData uri="http://schemas.openxmlformats.org/drawingml/2006/picture">
                 <pic:pic>
                   <pic:nvPicPr>
-                    <pic:cNvPr id="0" name="fig_avion.jpg"/>
+                    <pic:cNvPr id="0" name="c_blender.png"/>
                     <pic:cNvPicPr/>
                   </pic:nvPicPr>
                   <pic:blipFill>
@@ -1043,7 +996,7 @@
                   <pic:spPr>
                     <a:xfrm>
                       <a:off x="0" y="0"/>
-                      <a:ext cx="5580000" cy="1562863"/>
+                      <a:ext cx="5220000" cy="3006809"/>
                     </a:xfrm>
                     <a:prstGeom prst="rect"/>
                   </pic:spPr>
@@ -1075,7 +1028,7 @@
           <w:i/>
           <w:sz w:val="18"/>
         </w:rPr>
-        <w:t>La luz amarilla con el avión a dos alturas distintas.</w:t>
+        <w:t>Parte del script de Blender que separa la llanta, le pone el origen en su centro y exporta las dos piezas.</w:t>
       </w:r>
     </w:p>
     <w:p>
@@ -1087,7 +1040,7 @@
       <w:r>
         <w:drawing>
           <wp:inline xmlns:a="http://schemas.openxmlformats.org/drawingml/2006/main">
-            <wp:extent cx="5580000" cy="1562863"/>
+            <wp:extent cx="5400000" cy="2404903"/>
             <wp:docPr id="8" name="Picture 8"/>
             <wp:cNvGraphicFramePr>
               <a:graphicFrameLocks noChangeAspect="1"/>
@@ -1096,7 +1049,7 @@
               <a:graphicData uri="http://schemas.openxmlformats.org/drawingml/2006/picture">
                 <pic:pic>
                   <pic:nvPicPr>
-                    <pic:cNvPr id="0" name="fig_avion2.jpg"/>
+                    <pic:cNvPr id="0" name="c_rover.png"/>
                     <pic:cNvPicPr/>
                   </pic:nvPicPr>
                   <pic:blipFill>
@@ -1108,7 +1061,7 @@
                   <pic:spPr>
                     <a:xfrm>
                       <a:off x="0" y="0"/>
-                      <a:ext cx="5580000" cy="1562863"/>
+                      <a:ext cx="5400000" cy="2404903"/>
                     </a:xfrm>
                     <a:prstGeom prst="rect"/>
                   </pic:spPr>
@@ -1140,23 +1093,7 @@
           <w:i/>
           <w:sz w:val="18"/>
         </w:rPr>
-        <w:t>Altura inicial del avión y vista cercana.</w:t>
-      </w:r>
-    </w:p>
-    <w:p>
-      <w:pPr>
-        <w:spacing w:before="160" w:after="80" w:line="276" w:lineRule="auto"/>
-        <w:ind w:left="340"/>
-        <w:jc w:val="both"/>
-      </w:pPr>
-      <w:r>
-        <w:rPr>
-          <w:rFonts w:ascii="Arial" w:hAnsi="Arial" w:cs="Arial"/>
-          <w:b/>
-          <w:i w:val="0"/>
-          <w:sz w:val="24"/>
-        </w:rPr>
-        <w:t>c) Spotlight azul delantera (faro del rover)</w:t>
+        <w:t>Dibujo del rover: cada llanta toma la matriz de su pata, se traslada a su centro y gira sobre Z.</w:t>
       </w:r>
     </w:p>
     <w:p>
@@ -1172,7 +1109,7 @@
           <w:i w:val="0"/>
           <w:sz w:val="24"/>
         </w:rPr>
-        <w:t>Es spotLights[3]: color (0, 0, 1), intensidad difusa 5, atenuación con 1, lin 0.05 y exp 0.005, y un cono de 25°. Se coloca en el punto (6.9, 2.3, 0) de la matriz del rover, que está en el frente del cuerpo, y apunta en la dirección (1, −0.2, 0): hacia el frente del rover y un poco hacia el piso, para que el círculo quede delante de las llantas.</w:t>
+        <w:t>El rover avanza con Y y retrocede con U. El faro es spotLights[3]: azul (0, 0, 1), intensidad difusa 5, atenuación con 1, lin 0.05 y exp 0.005, cono de 25°. Se coloca en el punto (6.9, 2.3, 0) de la matriz del rover, en el frente del cuerpo, y apunta en (1, −0.2, 0), hacia adelante y un poco al piso. Al avanzar o retroceder, el círculo azul se queda delante del rover.</w:t>
       </w:r>
     </w:p>
     <w:p>
@@ -1242,22 +1179,6 @@
     </w:p>
     <w:p>
       <w:pPr>
-        <w:spacing w:before="0" w:after="120" w:line="276" w:lineRule="auto"/>
-        <w:ind w:left="340"/>
-        <w:jc w:val="both"/>
-      </w:pPr>
-      <w:r>
-        <w:rPr>
-          <w:rFonts w:ascii="Arial" w:hAnsi="Arial" w:cs="Arial"/>
-          <w:b w:val="0"/>
-          <w:i w:val="0"/>
-          <w:sz w:val="24"/>
-        </w:rPr>
-        <w:t>Para que el rover tenga jerarquía de llantas separé en Blender cada llanta de su pata. Las llantas tienen su propio material, así que se separaron por material; a cada llanta se le puso el origen en el centro de su caja envolvente y se exportó centrada, mientras la pata se exportó con sus coordenadas originales. El script guarda también los centros de las llantas, que son los que usa el programa, y el archivo rover_llantas_separadas.blend con la jerarquía cuerpo → pata → llanta.</w:t>
-      </w:r>
-    </w:p>
-    <w:p>
-      <w:pPr>
         <w:keepNext/>
         <w:spacing w:before="120" w:after="40"/>
         <w:jc w:val="center"/>
@@ -1265,7 +1186,7 @@
       <w:r>
         <w:drawing>
           <wp:inline xmlns:a="http://schemas.openxmlformats.org/drawingml/2006/main">
-            <wp:extent cx="5220000" cy="3006809"/>
+            <wp:extent cx="5580000" cy="1562863"/>
             <wp:docPr id="10" name="Picture 10"/>
             <wp:cNvGraphicFramePr>
               <a:graphicFrameLocks noChangeAspect="1"/>
@@ -1274,7 +1195,7 @@
               <a:graphicData uri="http://schemas.openxmlformats.org/drawingml/2006/picture">
                 <pic:pic>
                   <pic:nvPicPr>
-                    <pic:cNvPr id="0" name="c_blender.png"/>
+                    <pic:cNvPr id="0" name="fig_llantas.jpg"/>
                     <pic:cNvPicPr/>
                   </pic:nvPicPr>
                   <pic:blipFill>
@@ -1286,7 +1207,7 @@
                   <pic:spPr>
                     <a:xfrm>
                       <a:off x="0" y="0"/>
-                      <a:ext cx="5220000" cy="3006809"/>
+                      <a:ext cx="5580000" cy="1562863"/>
                     </a:xfrm>
                     <a:prstGeom prst="rect"/>
                   </pic:spPr>
@@ -1318,7 +1239,56 @@
           <w:i/>
           <w:sz w:val="18"/>
         </w:rPr>
-        <w:t>Parte del script de Blender que separa la llanta, le pone el origen en su centro y exporta las dos piezas.</w:t>
+        <w:t>La misma llanta antes y después de avanzar 0.35 unidades.</w:t>
+      </w:r>
+    </w:p>
+    <w:p>
+      <w:pPr>
+        <w:keepNext/>
+        <w:spacing w:before="160" w:after="80" w:line="276" w:lineRule="auto"/>
+        <w:ind w:left="340"/>
+        <w:jc w:val="both"/>
+      </w:pPr>
+      <w:r>
+        <w:rPr>
+          <w:rFonts w:ascii="Arial" w:hAnsi="Arial" w:cs="Arial"/>
+          <w:b/>
+          <w:i w:val="0"/>
+          <w:sz w:val="24"/>
+        </w:rPr>
+        <w:t>b) Luz del avión hacia abajo al subir y bajar</w:t>
+      </w:r>
+    </w:p>
+    <w:p>
+      <w:pPr>
+        <w:spacing w:before="0" w:after="120" w:line="276" w:lineRule="auto"/>
+        <w:ind w:left="340"/>
+        <w:jc w:val="both"/>
+      </w:pPr>
+      <w:r>
+        <w:rPr>
+          <w:rFonts w:ascii="Arial" w:hAnsi="Arial" w:cs="Arial"/>
+          <w:b w:val="0"/>
+          <w:i w:val="0"/>
+          <w:sz w:val="24"/>
+        </w:rPr>
+        <w:t>El avión es el de la práctica 6. spotLights[2] es amarilla (1, 1, 0), intensidad difusa 3, atenuación con 1, lin 0.1 y exp 0.01, cono de 25° y dirección fija (0, −1, 0). Su posición sale de la matriz del avión en el punto (0, −1.05, 0.5), debajo del fuselaje. Con flecha arriba el avión sube y con flecha abajo baja, y la luz va con él.</w:t>
+      </w:r>
+    </w:p>
+    <w:p>
+      <w:pPr>
+        <w:spacing w:before="0" w:after="120" w:line="276" w:lineRule="auto"/>
+        <w:ind w:left="340"/>
+        <w:jc w:val="both"/>
+      </w:pPr>
+      <w:r>
+        <w:rPr>
+          <w:rFonts w:ascii="Arial" w:hAnsi="Arial" w:cs="Arial"/>
+          <w:b w:val="0"/>
+          <w:i w:val="0"/>
+          <w:sz w:val="24"/>
+        </w:rPr>
+        <w:t>Con el avión arriba el círculo es más grande y más tenue: el cono abarca más piso y la atenuación crece con la distancia. Con el avión abajo el círculo es pequeño y brillante.</w:t>
       </w:r>
     </w:p>
     <w:p>
@@ -1330,7 +1300,7 @@
       <w:r>
         <w:drawing>
           <wp:inline xmlns:a="http://schemas.openxmlformats.org/drawingml/2006/main">
-            <wp:extent cx="5400000" cy="2404903"/>
+            <wp:extent cx="5580000" cy="1562863"/>
             <wp:docPr id="11" name="Picture 11"/>
             <wp:cNvGraphicFramePr>
               <a:graphicFrameLocks noChangeAspect="1"/>
@@ -1339,7 +1309,7 @@
               <a:graphicData uri="http://schemas.openxmlformats.org/drawingml/2006/picture">
                 <pic:pic>
                   <pic:nvPicPr>
-                    <pic:cNvPr id="0" name="c_rover.png"/>
+                    <pic:cNvPr id="0" name="fig_avion.jpg"/>
                     <pic:cNvPicPr/>
                   </pic:nvPicPr>
                   <pic:blipFill>
@@ -1351,7 +1321,7 @@
                   <pic:spPr>
                     <a:xfrm>
                       <a:off x="0" y="0"/>
-                      <a:ext cx="5400000" cy="2404903"/>
+                      <a:ext cx="5580000" cy="1562863"/>
                     </a:xfrm>
                     <a:prstGeom prst="rect"/>
                   </pic:spPr>
@@ -1383,23 +1353,7 @@
           <w:i/>
           <w:sz w:val="18"/>
         </w:rPr>
-        <w:t>Dibujo del rover: cada llanta toma la matriz de su pata, se traslada a su centro y gira sobre Z.</w:t>
-      </w:r>
-    </w:p>
-    <w:p>
-      <w:pPr>
-        <w:spacing w:before="0" w:after="120" w:line="276" w:lineRule="auto"/>
-        <w:ind w:left="340"/>
-        <w:jc w:val="both"/>
-      </w:pPr>
-      <w:r>
-        <w:rPr>
-          <w:rFonts w:ascii="Arial" w:hAnsi="Arial" w:cs="Arial"/>
-          <w:b w:val="0"/>
-          <w:i w:val="0"/>
-          <w:sz w:val="24"/>
-        </w:rPr>
-        <w:t>El giro de las llantas se calcula con la distancia recorrida desde la posición inicial entre el radio de la llanta (1.241 por la escala de 0.4). El signo es negativo porque el rover avanza hacia +X y la llanta gira sobre su eje Z.</w:t>
+        <w:t>La luz amarilla con el avión a dos alturas distintas.</w:t>
       </w:r>
     </w:p>
     <w:p>
@@ -1420,7 +1374,7 @@
               <a:graphicData uri="http://schemas.openxmlformats.org/drawingml/2006/picture">
                 <pic:pic>
                   <pic:nvPicPr>
-                    <pic:cNvPr id="0" name="fig_llantas.jpg"/>
+                    <pic:cNvPr id="0" name="fig_avion2.jpg"/>
                     <pic:cNvPicPr/>
                   </pic:nvPicPr>
                   <pic:blipFill>
@@ -1464,11 +1418,12 @@
           <w:i/>
           <w:sz w:val="18"/>
         </w:rPr>
-        <w:t>La misma llanta antes y después de avanzar 0.35 unidades.</w:t>
-      </w:r>
-    </w:p>
-    <w:p>
-      <w:pPr>
+        <w:t>Altura inicial del avión y vista cercana.</w:t>
+      </w:r>
+    </w:p>
+    <w:p>
+      <w:pPr>
+        <w:keepNext/>
         <w:spacing w:before="160" w:after="80" w:line="276" w:lineRule="auto"/>
         <w:ind w:left="340"/>
         <w:jc w:val="both"/>
@@ -1480,7 +1435,7 @@
           <w:i w:val="0"/>
           <w:sz w:val="24"/>
         </w:rPr>
-        <w:t>d) Lámpara importada con luz puntual blanca</w:t>
+        <w:t>c) Faro delantero del avión al avanzar y retroceder</w:t>
       </w:r>
     </w:p>
     <w:p>
@@ -1496,23 +1451,7 @@
           <w:i w:val="0"/>
           <w:sz w:val="24"/>
         </w:rPr>
-        <w:t>La lámpara es el modelo light-curved del paquete City Kit (Roads) de Kenney, que tiene licencia CC0. Se carga con la clase Model; su textura se llama colormap.png, así que la renombré a colormap_ciudad.png y cambié la referencia en el .mtl para que no se confundiera con otra textura del mismo nombre. Está en (−16, −1, 2.6), escalada 8 veces y girada 180° para que el brazo quede hacia el carril del rover.</w:t>
-      </w:r>
-    </w:p>
-    <w:p>
-      <w:pPr>
-        <w:spacing w:before="0" w:after="120" w:line="276" w:lineRule="auto"/>
-        <w:ind w:left="340"/>
-        <w:jc w:val="both"/>
-      </w:pPr>
-      <w:r>
-        <w:rPr>
-          <w:rFonts w:ascii="Arial" w:hAnsi="Arial" w:cs="Arial"/>
-          <w:b w:val="0"/>
-          <w:i w:val="0"/>
-          <w:sz w:val="24"/>
-        </w:rPr>
-        <w:t>La luz es pointLights[1]: blanca (1, 1, 1), intensidad difusa 2, atenuación con 1, lin 0.09 y exp 0.02. Su posición sale de multiplicar la matriz de la lámpara por el punto (0, 0.62, −0.175), justo debajo de la pantalla; si después se mueve o se escala la lámpara, la luz se queda en el mismo lugar del modelo.</w:t>
+        <w:t>La hélice del avión está hacia +Z, así que ese es su frente. Con H avanza y con J retrocede; posAvionZ entra en la traslación de la misma matriz base que ya usaba la luz inferior. El faro es spotLights[4]: naranja (1, 0.5, 0), intensidad difusa 5, atenuación con 1, lin 0.05 y exp 0.005, cono de 20°. Se coloca en (0, 0, 3.4), justo delante de la hélice, y apunta en (0, −0.5, 1) para que el círculo caiga en el piso delante del avión. Para tener cinco spotlight subí MAX_SPOT_LIGHTS de 4 a 5 en CommonValues.h y en shader_light.frag, porque los dos valores tienen que coincidir.</w:t>
       </w:r>
     </w:p>
     <w:p>
@@ -1524,8 +1463,171 @@
       <w:r>
         <w:drawing>
           <wp:inline xmlns:a="http://schemas.openxmlformats.org/drawingml/2006/main">
+            <wp:extent cx="5580000" cy="1562863"/>
+            <wp:docPr id="13" name="Picture 13"/>
+            <wp:cNvGraphicFramePr>
+              <a:graphicFrameLocks noChangeAspect="1"/>
+            </wp:cNvGraphicFramePr>
+            <a:graphic>
+              <a:graphicData uri="http://schemas.openxmlformats.org/drawingml/2006/picture">
+                <pic:pic>
+                  <pic:nvPicPr>
+                    <pic:cNvPr id="0" name="fig_faro_avion.jpg"/>
+                    <pic:cNvPicPr/>
+                  </pic:nvPicPr>
+                  <pic:blipFill>
+                    <a:blip r:embed="rId18"/>
+                    <a:stretch>
+                      <a:fillRect/>
+                    </a:stretch>
+                  </pic:blipFill>
+                  <pic:spPr>
+                    <a:xfrm>
+                      <a:off x="0" y="0"/>
+                      <a:ext cx="5580000" cy="1562863"/>
+                    </a:xfrm>
+                    <a:prstGeom prst="rect"/>
+                  </pic:spPr>
+                </pic:pic>
+              </a:graphicData>
+            </a:graphic>
+          </wp:inline>
+        </w:drawing>
+      </w:r>
+    </w:p>
+    <w:p>
+      <w:pPr>
+        <w:spacing w:after="200"/>
+        <w:jc w:val="center"/>
+      </w:pPr>
+      <w:r>
+        <w:rPr>
+          <w:rFonts w:ascii="Arial" w:hAnsi="Arial" w:cs="Arial"/>
+          <w:b/>
+          <w:i/>
+          <w:sz w:val="18"/>
+        </w:rPr>
+        <w:t xml:space="preserve">Figura 11. </w:t>
+      </w:r>
+      <w:r>
+        <w:rPr>
+          <w:rFonts w:ascii="Arial" w:hAnsi="Arial" w:cs="Arial"/>
+          <w:b w:val="0"/>
+          <w:i/>
+          <w:sz w:val="18"/>
+        </w:rPr>
+        <w:t>Vista lateral: al avanzar el avión con H, el círculo naranja y el amarillo se mueven con él.</w:t>
+      </w:r>
+    </w:p>
+    <w:p>
+      <w:pPr>
+        <w:keepNext/>
+        <w:spacing w:before="120" w:after="40"/>
+        <w:jc w:val="center"/>
+      </w:pPr>
+      <w:r>
+        <w:drawing>
+          <wp:inline xmlns:a="http://schemas.openxmlformats.org/drawingml/2006/main">
+            <wp:extent cx="5580000" cy="1562863"/>
+            <wp:docPr id="14" name="Picture 14"/>
+            <wp:cNvGraphicFramePr>
+              <a:graphicFrameLocks noChangeAspect="1"/>
+            </wp:cNvGraphicFramePr>
+            <a:graphic>
+              <a:graphicData uri="http://schemas.openxmlformats.org/drawingml/2006/picture">
+                <pic:pic>
+                  <pic:nvPicPr>
+                    <pic:cNvPr id="0" name="fig_faro_avion2.jpg"/>
+                    <pic:cNvPicPr/>
+                  </pic:nvPicPr>
+                  <pic:blipFill>
+                    <a:blip r:embed="rId19"/>
+                    <a:stretch>
+                      <a:fillRect/>
+                    </a:stretch>
+                  </pic:blipFill>
+                  <pic:spPr>
+                    <a:xfrm>
+                      <a:off x="0" y="0"/>
+                      <a:ext cx="5580000" cy="1562863"/>
+                    </a:xfrm>
+                    <a:prstGeom prst="rect"/>
+                  </pic:spPr>
+                </pic:pic>
+              </a:graphicData>
+            </a:graphic>
+          </wp:inline>
+        </w:drawing>
+      </w:r>
+    </w:p>
+    <w:p>
+      <w:pPr>
+        <w:spacing w:after="200"/>
+        <w:jc w:val="center"/>
+      </w:pPr>
+      <w:r>
+        <w:rPr>
+          <w:rFonts w:ascii="Arial" w:hAnsi="Arial" w:cs="Arial"/>
+          <w:b/>
+          <w:i/>
+          <w:sz w:val="18"/>
+        </w:rPr>
+        <w:t xml:space="preserve">Figura 12. </w:t>
+      </w:r>
+      <w:r>
+        <w:rPr>
+          <w:rFonts w:ascii="Arial" w:hAnsi="Arial" w:cs="Arial"/>
+          <w:b w:val="0"/>
+          <w:i/>
+          <w:sz w:val="18"/>
+        </w:rPr>
+        <w:t>Desde atrás del avión se ve el faro naranja delante y la luz amarilla debajo.</w:t>
+      </w:r>
+    </w:p>
+    <w:p>
+      <w:pPr>
+        <w:keepNext/>
+        <w:spacing w:before="160" w:after="80" w:line="276" w:lineRule="auto"/>
+        <w:ind w:left="340"/>
+        <w:jc w:val="both"/>
+      </w:pPr>
+      <w:r>
+        <w:rPr>
+          <w:rFonts w:ascii="Arial" w:hAnsi="Arial" w:cs="Arial"/>
+          <w:b/>
+          <w:i w:val="0"/>
+          <w:sz w:val="24"/>
+        </w:rPr>
+        <w:t>d) Lámpara importada con luz puntual blanca</w:t>
+      </w:r>
+    </w:p>
+    <w:p>
+      <w:pPr>
+        <w:spacing w:before="0" w:after="120" w:line="276" w:lineRule="auto"/>
+        <w:ind w:left="340"/>
+        <w:jc w:val="both"/>
+      </w:pPr>
+      <w:r>
+        <w:rPr>
+          <w:rFonts w:ascii="Arial" w:hAnsi="Arial" w:cs="Arial"/>
+          <w:b w:val="0"/>
+          <w:i w:val="0"/>
+          <w:sz w:val="24"/>
+        </w:rPr>
+        <w:t>La lámpara es el modelo light-curved del paquete City Kit (Roads) de Kenney, con licencia CC0. Se carga con la clase Model; su textura se llama colormap.png, así que la renombré a colormap_ciudad.png y cambié la referencia en el .mtl. Está en (−16, −1, 2.6), escalada 8 veces y girada 180°. La luz es pointLights[1]: blanca (1, 1, 1), intensidad difusa 2, atenuación con 1, lin 0.09 y exp 0.02, en el punto (0, 0.62, −0.175) de la matriz de la lámpara, justo debajo de la pantalla.</w:t>
+      </w:r>
+    </w:p>
+    <w:p>
+      <w:pPr>
+        <w:keepNext/>
+        <w:spacing w:before="120" w:after="40"/>
+        <w:jc w:val="center"/>
+      </w:pPr>
+      <w:r>
+        <w:drawing>
+          <wp:inline xmlns:a="http://schemas.openxmlformats.org/drawingml/2006/main">
             <wp:extent cx="5220000" cy="1237017"/>
-            <wp:docPr id="13" name="Picture 13"/>
+            <wp:docPr id="15" name="Picture 15"/>
             <wp:cNvGraphicFramePr>
               <a:graphicFrameLocks noChangeAspect="1"/>
             </wp:cNvGraphicFramePr>
@@ -1537,7 +1639,7 @@
                     <pic:cNvPicPr/>
                   </pic:nvPicPr>
                   <pic:blipFill>
-                    <a:blip r:embed="rId18"/>
+                    <a:blip r:embed="rId20"/>
                     <a:stretch>
                       <a:fillRect/>
                     </a:stretch>
@@ -1568,7 +1670,7 @@
           <w:i/>
           <w:sz w:val="18"/>
         </w:rPr>
-        <w:t xml:space="preserve">Figura 11. </w:t>
+        <w:t xml:space="preserve">Figura 13. </w:t>
       </w:r>
       <w:r>
         <w:rPr>
@@ -1590,7 +1692,7 @@
         <w:drawing>
           <wp:inline xmlns:a="http://schemas.openxmlformats.org/drawingml/2006/main">
             <wp:extent cx="5400000" cy="3036018"/>
-            <wp:docPr id="14" name="Picture 14"/>
+            <wp:docPr id="16" name="Picture 16"/>
             <wp:cNvGraphicFramePr>
               <a:graphicFrameLocks noChangeAspect="1"/>
             </wp:cNvGraphicFramePr>
@@ -1602,7 +1704,7 @@
                     <pic:cNvPicPr/>
                   </pic:nvPicPr>
                   <pic:blipFill>
-                    <a:blip r:embed="rId19"/>
+                    <a:blip r:embed="rId21"/>
                     <a:stretch>
                       <a:fillRect/>
                     </a:stretch>
@@ -1633,7 +1735,7 @@
           <w:i/>
           <w:sz w:val="18"/>
         </w:rPr>
-        <w:t xml:space="preserve">Figura 12. </w:t>
+        <w:t xml:space="preserve">Figura 14. </w:t>
       </w:r>
       <w:r>
         <w:rPr>
@@ -1667,7 +1769,7 @@
           <w:i w:val="0"/>
           <w:sz w:val="24"/>
         </w:rPr>
-        <w:t>W, A, S, D y ratón mueven la cámara; Y y U, el rover; flecha arriba y flecha abajo, el avión; L enciende o apaga la linterna; Esc cierra el programa.</w:t>
+        <w:t>W, A, S, D y ratón mueven la cámara; Y y U, el rover; flecha arriba y flecha abajo suben y bajan el avión; H y J lo mueven hacia adelante y hacia atrás; L enciende o apaga la linterna; Esc cierra el programa.</w:t>
       </w:r>
     </w:p>
     <w:p>
@@ -1724,7 +1826,7 @@
         <w:drawing>
           <wp:inline xmlns:a="http://schemas.openxmlformats.org/drawingml/2006/main">
             <wp:extent cx="5220000" cy="914637"/>
-            <wp:docPr id="15" name="Picture 15"/>
+            <wp:docPr id="17" name="Picture 17"/>
             <wp:cNvGraphicFramePr>
               <a:graphicFrameLocks noChangeAspect="1"/>
             </wp:cNvGraphicFramePr>
@@ -1736,7 +1838,7 @@
                     <pic:cNvPicPr/>
                   </pic:nvPicPr>
                   <pic:blipFill>
-                    <a:blip r:embed="rId20"/>
+                    <a:blip r:embed="rId22"/>
                     <a:stretch>
                       <a:fillRect/>
                     </a:stretch>
@@ -1767,7 +1869,7 @@
           <w:i/>
           <w:sz w:val="18"/>
         </w:rPr>
-        <w:t xml:space="preserve">Figura 13. </w:t>
+        <w:t xml:space="preserve">Figura 15. </w:t>
       </w:r>
       <w:r>
         <w:rPr>
@@ -1852,6 +1954,31 @@
           <w:sz w:val="24"/>
         </w:rPr>
         <w:t>El constructor Window(ancho, alto) no inicializaba mouseFirstMoved, lastX ni lastY. Los inicialicé.</w:t>
+      </w:r>
+    </w:p>
+    <w:p>
+      <w:pPr>
+        <w:spacing w:before="0" w:after="120" w:line="276" w:lineRule="auto"/>
+        <w:ind w:left="340"/>
+        <w:jc w:val="both"/>
+      </w:pPr>
+      <w:r>
+        <w:rPr>
+          <w:rFonts w:ascii="Arial" w:hAnsi="Arial" w:cs="Arial"/>
+          <w:b/>
+          <w:i w:val="0"/>
+          <w:sz w:val="24"/>
+        </w:rPr>
+        <w:t xml:space="preserve">Más de cuatro spotlight. </w:t>
+      </w:r>
+      <w:r>
+        <w:rPr>
+          <w:rFonts w:ascii="Arial" w:hAnsi="Arial" w:cs="Arial"/>
+          <w:b w:val="0"/>
+          <w:i w:val="0"/>
+          <w:sz w:val="24"/>
+        </w:rPr>
+        <w:t>Al agregar el faro del avión el arreglo de luces ya tenía cuatro (linterna, luz verde, avión y rover). Hay que subir el máximo en CommonValues.h y en la constante del fragment shader al mismo tiempo; si solo se cambia uno, el programa manda luces que el shader no tiene o se pierden ubicaciones uniform.</w:t>
       </w:r>
     </w:p>
     <w:p>
@@ -1984,7 +2111,7 @@
           <w:i w:val="0"/>
           <w:sz w:val="24"/>
         </w:rPr>
-        <w:t>La complejidad fue media. Las dos spotlight se resuelven igual: la posición de la luz se calcula con la matriz que se usa para dibujar el modelo, así que el faro y la luz del avión no se separan aunque cambien la posición o la escala. La luz puntual de la lámpara es fija y solo hubo que elegir el punto debajo de la pantalla. Lo que más trabajo dio fue la jerarquía de llantas del rover, porque hubo que separar las piezas en Blender sin mover la bisagra de cada pata y calcular el giro a partir de la distancia recorrida.</w:t>
+        <w:t>La complejidad fue media. Las tres spotlight se resuelven igual: la posición de la luz se calcula con la matriz que se usa para dibujar el modelo, así que el faro del rover y las dos luces del avión no se separan aunque cambien la posición o la escala. La luz puntual de la lámpara es fija y solo hubo que elegir el punto debajo de la pantalla. Lo que más trabajo dio fue la jerarquía de llantas del rover, porque hubo que separar las piezas en Blender sin mover la bisagra de cada pata y calcular el giro a partir de la distancia recorrida.</w:t>
       </w:r>
     </w:p>
     <w:p>

</xml_diff>